<commit_message>
Reformat Special Stains DOCX: Legal size, two-column, monochrome, no page breaks
- Change page size from A4 to US Legal (8.5 x 14 in).
- Use a full-width title banner then a continuous two-column body so lines
  stay short and easy to read.
- Remove all page breaks; content flows continuously.
- Monochrome-friendly styling for mono printing: black headings, no colour,
  pale-grey heading bands and black rules for emphasis; serif body (Cambria)
  for print readability.
</commit_message>
<xml_diff>
--- a/Special Stains.docx
+++ b/Special Stains.docx
@@ -9,14 +9,41 @@
       </w:pPr>
       <w:r>
         <w:rPr>
-          <w:b w:val="0"/>
+          <w:color w:val="000000"/>
         </w:rPr>
         <w:t>SPECIAL STAINS</w:t>
       </w:r>
     </w:p>
     <w:p>
       <w:pPr>
+        <w:jc w:val="center"/>
+        <w:pBdr>
+          <w:bottom w:val="single" w:sz="12" w:space="3" w:color="000000"/>
+        </w:pBdr>
+      </w:pPr>
+      <w:r>
+        <w:rPr>
+          <w:i/>
+          <w:sz w:val="22"/>
+        </w:rPr>
+        <w:t>Histopathology — Special Staining Techniques</w:t>
+      </w:r>
+    </w:p>
+    <w:p/>
+    <w:p>
+      <w:pPr>
+        <w:sectPr>
+          <w:pgSz w:w="12240" w:h="20160"/>
+          <w:pgMar w:top="850" w:right="850" w:bottom="850" w:left="850" w:header="720" w:footer="720" w:gutter="0"/>
+          <w:cols w:space="340" w:num="1" w:sep="1"/>
+          <w:docGrid w:linePitch="360"/>
+        </w:sectPr>
+      </w:pPr>
+    </w:p>
+    <w:p>
+      <w:pPr>
         <w:pStyle w:val="Heading1"/>
+        <w:shd w:val="clear" w:color="auto" w:fill="E6E6E6"/>
       </w:pPr>
       <w:r>
         <w:rPr>
@@ -345,13 +372,9 @@
       </w:r>
     </w:p>
     <w:p>
-      <w:r>
-        <w:br w:type="page"/>
-      </w:r>
-    </w:p>
-    <w:p>
       <w:pPr>
         <w:pStyle w:val="Heading1"/>
+        <w:shd w:val="clear" w:color="auto" w:fill="E6E6E6"/>
       </w:pPr>
       <w:r>
         <w:rPr>
@@ -363,6 +386,9 @@
     <w:p>
       <w:pPr>
         <w:pStyle w:val="Heading2"/>
+        <w:pBdr>
+          <w:bottom w:val="single" w:sz="4" w:space="3" w:color="000000"/>
+        </w:pBdr>
       </w:pPr>
       <w:r>
         <w:rPr>
@@ -1304,13 +1330,9 @@
       </w:r>
     </w:p>
     <w:p>
-      <w:r>
-        <w:br w:type="page"/>
-      </w:r>
-    </w:p>
-    <w:p>
       <w:pPr>
         <w:pStyle w:val="Heading1"/>
+        <w:shd w:val="clear" w:color="auto" w:fill="E6E6E6"/>
       </w:pPr>
       <w:r>
         <w:rPr>
@@ -1322,6 +1344,9 @@
     <w:p>
       <w:pPr>
         <w:pStyle w:val="Heading2"/>
+        <w:pBdr>
+          <w:bottom w:val="single" w:sz="4" w:space="3" w:color="000000"/>
+        </w:pBdr>
       </w:pPr>
       <w:r>
         <w:rPr>
@@ -2036,13 +2061,9 @@
       </w:r>
     </w:p>
     <w:p>
-      <w:r>
-        <w:br w:type="page"/>
-      </w:r>
-    </w:p>
-    <w:p>
       <w:pPr>
         <w:pStyle w:val="Heading1"/>
+        <w:shd w:val="clear" w:color="auto" w:fill="E6E6E6"/>
       </w:pPr>
       <w:r>
         <w:rPr>
@@ -2054,6 +2075,9 @@
     <w:p>
       <w:pPr>
         <w:pStyle w:val="Heading2"/>
+        <w:pBdr>
+          <w:bottom w:val="single" w:sz="4" w:space="3" w:color="000000"/>
+        </w:pBdr>
       </w:pPr>
       <w:r>
         <w:rPr>
@@ -2596,13 +2620,9 @@
       </w:r>
     </w:p>
     <w:p>
-      <w:r>
-        <w:br w:type="page"/>
-      </w:r>
-    </w:p>
-    <w:p>
       <w:pPr>
         <w:pStyle w:val="Heading1"/>
+        <w:shd w:val="clear" w:color="auto" w:fill="E6E6E6"/>
       </w:pPr>
       <w:r>
         <w:rPr>
@@ -2614,6 +2634,9 @@
     <w:p>
       <w:pPr>
         <w:pStyle w:val="Heading2"/>
+        <w:pBdr>
+          <w:bottom w:val="single" w:sz="4" w:space="3" w:color="000000"/>
+        </w:pBdr>
       </w:pPr>
       <w:r>
         <w:rPr>
@@ -3379,13 +3402,9 @@
       </w:r>
     </w:p>
     <w:p>
-      <w:r>
-        <w:br w:type="page"/>
-      </w:r>
-    </w:p>
-    <w:p>
       <w:pPr>
         <w:pStyle w:val="Heading1"/>
+        <w:shd w:val="clear" w:color="auto" w:fill="E6E6E6"/>
       </w:pPr>
       <w:r>
         <w:rPr>
@@ -3397,6 +3416,9 @@
     <w:p>
       <w:pPr>
         <w:pStyle w:val="Heading2"/>
+        <w:pBdr>
+          <w:bottom w:val="single" w:sz="4" w:space="3" w:color="000000"/>
+        </w:pBdr>
       </w:pPr>
       <w:r>
         <w:rPr>
@@ -4222,13 +4244,9 @@
       </w:r>
     </w:p>
     <w:p>
-      <w:r>
-        <w:br w:type="page"/>
-      </w:r>
-    </w:p>
-    <w:p>
       <w:pPr>
         <w:pStyle w:val="Heading1"/>
+        <w:shd w:val="clear" w:color="auto" w:fill="E6E6E6"/>
       </w:pPr>
       <w:r>
         <w:rPr>
@@ -4240,6 +4258,9 @@
     <w:p>
       <w:pPr>
         <w:pStyle w:val="Heading2"/>
+        <w:pBdr>
+          <w:bottom w:val="single" w:sz="4" w:space="3" w:color="000000"/>
+        </w:pBdr>
       </w:pPr>
       <w:r>
         <w:rPr>
@@ -4806,13 +4827,9 @@
       </w:r>
     </w:p>
     <w:p>
-      <w:r>
-        <w:br w:type="page"/>
-      </w:r>
-    </w:p>
-    <w:p>
       <w:pPr>
         <w:pStyle w:val="Heading1"/>
+        <w:shd w:val="clear" w:color="auto" w:fill="E6E6E6"/>
       </w:pPr>
       <w:r>
         <w:rPr>
@@ -4824,6 +4841,9 @@
     <w:p>
       <w:pPr>
         <w:pStyle w:val="Heading2"/>
+        <w:pBdr>
+          <w:bottom w:val="single" w:sz="4" w:space="3" w:color="000000"/>
+        </w:pBdr>
       </w:pPr>
       <w:r>
         <w:rPr>
@@ -5404,13 +5424,9 @@
       </w:r>
     </w:p>
     <w:p>
-      <w:r>
-        <w:br w:type="page"/>
-      </w:r>
-    </w:p>
-    <w:p>
       <w:pPr>
         <w:pStyle w:val="Heading1"/>
+        <w:shd w:val="clear" w:color="auto" w:fill="E6E6E6"/>
       </w:pPr>
       <w:r>
         <w:rPr>
@@ -5422,6 +5438,9 @@
     <w:p>
       <w:pPr>
         <w:pStyle w:val="Heading2"/>
+        <w:pBdr>
+          <w:bottom w:val="single" w:sz="4" w:space="3" w:color="000000"/>
+        </w:pBdr>
       </w:pPr>
       <w:r>
         <w:rPr>
@@ -6164,13 +6183,9 @@
       </w:r>
     </w:p>
     <w:p>
-      <w:r>
-        <w:br w:type="page"/>
-      </w:r>
-    </w:p>
-    <w:p>
       <w:pPr>
         <w:pStyle w:val="Heading1"/>
+        <w:shd w:val="clear" w:color="auto" w:fill="E6E6E6"/>
       </w:pPr>
       <w:r>
         <w:rPr>
@@ -6182,6 +6197,9 @@
     <w:p>
       <w:pPr>
         <w:pStyle w:val="Heading2"/>
+        <w:pBdr>
+          <w:bottom w:val="single" w:sz="4" w:space="3" w:color="000000"/>
+        </w:pBdr>
       </w:pPr>
       <w:r>
         <w:rPr>
@@ -6638,9 +6656,10 @@
       </w:r>
     </w:p>
     <w:sectPr>
-      <w:pgSz w:w="11906" w:h="16838"/>
-      <w:pgMar w:top="1134" w:right="1247" w:bottom="1134" w:left="1247" w:header="720" w:footer="720" w:gutter="0"/>
-      <w:cols w:space="720"/>
+      <w:type w:val="continuous"/>
+      <w:pgSz w:w="12240" w:h="20160"/>
+      <w:pgMar w:top="850" w:right="850" w:bottom="850" w:left="850" w:header="720" w:footer="720" w:gutter="0"/>
+      <w:cols w:space="360" w:num="2" w:sep="1"/>
       <w:docGrid w:linePitch="360"/>
     </w:sectPr>
   </w:body>
@@ -7011,11 +7030,13 @@
     <w:qFormat/>
     <w:rsid w:val="00FC693F"/>
     <w:pPr>
-      <w:spacing w:after="80" w:line="276" w:lineRule="auto"/>
+      <w:widowControl/>
+      <w:spacing w:after="60" w:line="259" w:lineRule="auto"/>
     </w:pPr>
     <w:rPr>
-      <w:rFonts w:ascii="Calibri" w:hAnsi="Calibri"/>
-      <w:sz w:val="22"/>
+      <w:rFonts w:ascii="Cambria" w:hAnsi="Cambria"/>
+      <w:color w:val="000000"/>
+      <w:sz w:val="19"/>
     </w:rPr>
   </w:style>
   <w:style w:type="paragraph" w:styleId="Header">
@@ -7073,15 +7094,15 @@
     <w:pPr>
       <w:keepNext/>
       <w:keepLines/>
-      <w:spacing w:before="480" w:after="0"/>
+      <w:spacing w:before="120" w:after="40"/>
       <w:outlineLvl w:val="0"/>
     </w:pPr>
     <w:rPr>
-      <w:rFonts w:asciiTheme="majorHAnsi" w:eastAsiaTheme="majorEastAsia" w:hAnsiTheme="majorHAnsi" w:cstheme="majorBidi"/>
+      <w:rFonts w:asciiTheme="majorHAnsi" w:eastAsiaTheme="majorEastAsia" w:hAnsiTheme="majorHAnsi" w:cstheme="majorBidi" w:ascii="Calibri" w:hAnsi="Calibri"/>
       <w:b/>
       <w:bCs/>
-      <w:color w:val="365F91" w:themeColor="accent1" w:themeShade="BF"/>
-      <w:sz w:val="28"/>
+      <w:color w:val="000000"/>
+      <w:sz w:val="26"/>
       <w:szCs w:val="28"/>
     </w:rPr>
   </w:style>
@@ -7097,15 +7118,15 @@
     <w:pPr>
       <w:keepNext/>
       <w:keepLines/>
-      <w:spacing w:before="200" w:after="0"/>
+      <w:spacing w:before="120" w:after="40"/>
       <w:outlineLvl w:val="1"/>
     </w:pPr>
     <w:rPr>
-      <w:rFonts w:asciiTheme="majorHAnsi" w:eastAsiaTheme="majorEastAsia" w:hAnsiTheme="majorHAnsi" w:cstheme="majorBidi"/>
+      <w:rFonts w:asciiTheme="majorHAnsi" w:eastAsiaTheme="majorEastAsia" w:hAnsiTheme="majorHAnsi" w:cstheme="majorBidi" w:ascii="Calibri" w:hAnsi="Calibri"/>
       <w:b/>
       <w:bCs/>
-      <w:color w:val="4F81BD" w:themeColor="accent1"/>
-      <w:sz w:val="26"/>
+      <w:color w:val="1A1A1A"/>
+      <w:sz w:val="23"/>
       <w:szCs w:val="26"/>
     </w:rPr>
   </w:style>
@@ -7121,14 +7142,15 @@
     <w:pPr>
       <w:keepNext/>
       <w:keepLines/>
-      <w:spacing w:before="200" w:after="0"/>
+      <w:spacing w:before="120" w:after="40"/>
       <w:outlineLvl w:val="2"/>
     </w:pPr>
     <w:rPr>
-      <w:rFonts w:asciiTheme="majorHAnsi" w:eastAsiaTheme="majorEastAsia" w:hAnsiTheme="majorHAnsi" w:cstheme="majorBidi"/>
+      <w:rFonts w:asciiTheme="majorHAnsi" w:eastAsiaTheme="majorEastAsia" w:hAnsiTheme="majorHAnsi" w:cstheme="majorBidi" w:ascii="Calibri" w:hAnsi="Calibri"/>
       <w:b/>
       <w:bCs/>
-      <w:color w:val="4F81BD" w:themeColor="accent1"/>
+      <w:color w:val="1A1A1A"/>
+      <w:sz w:val="21"/>
     </w:rPr>
   </w:style>
   <w:style w:type="paragraph" w:styleId="Heading4">
@@ -7366,11 +7388,12 @@
       <w:contextualSpacing/>
     </w:pPr>
     <w:rPr>
-      <w:rFonts w:asciiTheme="majorHAnsi" w:eastAsiaTheme="majorEastAsia" w:hAnsiTheme="majorHAnsi" w:cstheme="majorBidi"/>
-      <w:color w:val="17365D" w:themeColor="text2" w:themeShade="BF"/>
+      <w:rFonts w:asciiTheme="majorHAnsi" w:eastAsiaTheme="majorEastAsia" w:hAnsiTheme="majorHAnsi" w:cstheme="majorBidi" w:ascii="Calibri" w:hAnsi="Calibri"/>
+      <w:b/>
+      <w:color w:val="000000"/>
       <w:spacing w:val="5"/>
       <w:kern w:val="28"/>
-      <w:sz w:val="52"/>
+      <w:sz w:val="44"/>
       <w:szCs w:val="52"/>
     </w:rPr>
   </w:style>

</xml_diff>

<commit_message>
Use two-column layout only for short list blocks; single column elsewhere
Apply two columns selectively to short vertical lists (Requirements/Results
style blocks where the right side would otherwise stay blank), detected
automatically by item count and line length. All other content (paragraphs,
principles, procedures, applications, mixed lists) stays single column.
Implemented with continuous section breaks so no page breaks are introduced;
Legal page size and monochrome styling retained.
</commit_message>
<xml_diff>
--- a/Special Stains.docx
+++ b/Special Stains.docx
@@ -8,9 +8,6 @@
         <w:jc w:val="center"/>
       </w:pPr>
       <w:r>
-        <w:rPr>
-          <w:color w:val="000000"/>
-        </w:rPr>
         <w:t>SPECIAL STAINS</w:t>
       </w:r>
     </w:p>
@@ -29,13 +26,12 @@
         <w:t>Histopathology — Special Staining Techniques</w:t>
       </w:r>
     </w:p>
-    <w:p/>
     <w:p>
       <w:pPr>
         <w:sectPr>
           <w:pgSz w:w="12240" w:h="20160"/>
           <w:pgMar w:top="850" w:right="850" w:bottom="850" w:left="850" w:header="720" w:footer="720" w:gutter="0"/>
-          <w:cols w:space="340" w:num="1" w:sep="1"/>
+          <w:cols w:space="360" w:num="1" w:sep="0"/>
           <w:docGrid w:linePitch="360"/>
         </w:sectPr>
       </w:pPr>
@@ -719,6 +715,17 @@
     </w:p>
     <w:p>
       <w:pPr>
+        <w:sectPr>
+          <w:type w:val="continuous"/>
+          <w:pgSz w:w="12240" w:h="20160"/>
+          <w:pgMar w:top="850" w:right="850" w:bottom="850" w:left="850" w:header="720" w:footer="720" w:gutter="0"/>
+          <w:cols w:space="360" w:num="1" w:sep="0"/>
+          <w:docGrid w:linePitch="360"/>
+        </w:sectPr>
+      </w:pPr>
+    </w:p>
+    <w:p>
+      <w:pPr>
         <w:pStyle w:val="ListBullet"/>
       </w:pPr>
       <w:r>
@@ -815,6 +822,17 @@
         </w:rPr>
         <w:t>Activated Charcoal — 500 mg</w:t>
       </w:r>
+    </w:p>
+    <w:p>
+      <w:pPr>
+        <w:sectPr>
+          <w:type w:val="continuous"/>
+          <w:pgSz w:w="12240" w:h="20160"/>
+          <w:pgMar w:top="850" w:right="850" w:bottom="850" w:left="850" w:header="720" w:footer="720" w:gutter="0"/>
+          <w:cols w:space="360" w:num="2" w:sep="1"/>
+          <w:docGrid w:linePitch="360"/>
+        </w:sectPr>
+      </w:pPr>
     </w:p>
     <w:p>
       <w:r>
@@ -1944,6 +1962,17 @@
     </w:p>
     <w:p>
       <w:pPr>
+        <w:sectPr>
+          <w:type w:val="continuous"/>
+          <w:pgSz w:w="12240" w:h="20160"/>
+          <w:pgMar w:top="850" w:right="850" w:bottom="850" w:left="850" w:header="720" w:footer="720" w:gutter="0"/>
+          <w:cols w:space="360" w:num="1" w:sep="0"/>
+          <w:docGrid w:linePitch="360"/>
+        </w:sectPr>
+      </w:pPr>
+    </w:p>
+    <w:p>
+      <w:pPr>
         <w:pStyle w:val="ListBullet"/>
       </w:pPr>
       <w:r>
@@ -1974,6 +2003,17 @@
         </w:rPr>
         <w:t>Muscle, Cytoplasm, Erythrocytes — Red</w:t>
       </w:r>
+    </w:p>
+    <w:p>
+      <w:pPr>
+        <w:sectPr>
+          <w:type w:val="continuous"/>
+          <w:pgSz w:w="12240" w:h="20160"/>
+          <w:pgMar w:top="850" w:right="850" w:bottom="850" w:left="850" w:header="720" w:footer="720" w:gutter="0"/>
+          <w:cols w:space="360" w:num="2" w:sep="1"/>
+          <w:docGrid w:linePitch="360"/>
+        </w:sectPr>
+      </w:pPr>
     </w:p>
     <w:p>
       <w:r>
@@ -2484,6 +2524,17 @@
     </w:p>
     <w:p>
       <w:pPr>
+        <w:sectPr>
+          <w:type w:val="continuous"/>
+          <w:pgSz w:w="12240" w:h="20160"/>
+          <w:pgMar w:top="850" w:right="850" w:bottom="850" w:left="850" w:header="720" w:footer="720" w:gutter="0"/>
+          <w:cols w:space="360" w:num="1" w:sep="0"/>
+          <w:docGrid w:linePitch="360"/>
+        </w:sectPr>
+      </w:pPr>
+    </w:p>
+    <w:p>
+      <w:pPr>
         <w:pStyle w:val="ListBullet"/>
       </w:pPr>
       <w:r>
@@ -2514,6 +2565,17 @@
         </w:rPr>
         <w:t>Erythrocytes — deep purplish blue</w:t>
       </w:r>
+    </w:p>
+    <w:p>
+      <w:pPr>
+        <w:sectPr>
+          <w:type w:val="continuous"/>
+          <w:pgSz w:w="12240" w:h="20160"/>
+          <w:pgMar w:top="850" w:right="850" w:bottom="850" w:left="850" w:header="720" w:footer="720" w:gutter="0"/>
+          <w:cols w:space="360" w:num="2" w:sep="1"/>
+          <w:docGrid w:linePitch="360"/>
+        </w:sectPr>
+      </w:pPr>
     </w:p>
     <w:p>
       <w:r>
@@ -2973,6 +3035,17 @@
     </w:p>
     <w:p>
       <w:pPr>
+        <w:sectPr>
+          <w:type w:val="continuous"/>
+          <w:pgSz w:w="12240" w:h="20160"/>
+          <w:pgMar w:top="850" w:right="850" w:bottom="850" w:left="850" w:header="720" w:footer="720" w:gutter="0"/>
+          <w:cols w:space="360" w:num="1" w:sep="0"/>
+          <w:docGrid w:linePitch="360"/>
+        </w:sectPr>
+      </w:pPr>
+    </w:p>
+    <w:p>
+      <w:pPr>
         <w:pStyle w:val="ListNumber"/>
       </w:pPr>
       <w:r>
@@ -3014,6 +3087,17 @@
         </w:rPr>
         <w:t>Coverslips</w:t>
       </w:r>
+    </w:p>
+    <w:p>
+      <w:pPr>
+        <w:sectPr>
+          <w:type w:val="continuous"/>
+          <w:pgSz w:w="12240" w:h="20160"/>
+          <w:pgMar w:top="850" w:right="850" w:bottom="850" w:left="850" w:header="720" w:footer="720" w:gutter="0"/>
+          <w:cols w:space="360" w:num="2" w:sep="1"/>
+          <w:docGrid w:linePitch="360"/>
+        </w:sectPr>
+      </w:pPr>
     </w:p>
     <w:p>
       <w:r>
@@ -3712,6 +3796,17 @@
     </w:p>
     <w:p>
       <w:pPr>
+        <w:sectPr>
+          <w:type w:val="continuous"/>
+          <w:pgSz w:w="12240" w:h="20160"/>
+          <w:pgMar w:top="850" w:right="850" w:bottom="850" w:left="850" w:header="720" w:footer="720" w:gutter="0"/>
+          <w:cols w:space="360" w:num="1" w:sep="0"/>
+          <w:docGrid w:linePitch="360"/>
+        </w:sectPr>
+      </w:pPr>
+    </w:p>
+    <w:p>
+      <w:pPr>
         <w:pStyle w:val="ListNumber"/>
       </w:pPr>
       <w:r>
@@ -3764,6 +3859,17 @@
         </w:rPr>
         <w:t>Coverslips</w:t>
       </w:r>
+    </w:p>
+    <w:p>
+      <w:pPr>
+        <w:sectPr>
+          <w:type w:val="continuous"/>
+          <w:pgSz w:w="12240" w:h="20160"/>
+          <w:pgMar w:top="850" w:right="850" w:bottom="850" w:left="850" w:header="720" w:footer="720" w:gutter="0"/>
+          <w:cols w:space="360" w:num="2" w:sep="1"/>
+          <w:docGrid w:linePitch="360"/>
+        </w:sectPr>
+      </w:pPr>
     </w:p>
     <w:p>
       <w:r>
@@ -4417,6 +4523,17 @@
     </w:p>
     <w:p>
       <w:pPr>
+        <w:sectPr>
+          <w:type w:val="continuous"/>
+          <w:pgSz w:w="12240" w:h="20160"/>
+          <w:pgMar w:top="850" w:right="850" w:bottom="850" w:left="850" w:header="720" w:footer="720" w:gutter="0"/>
+          <w:cols w:space="360" w:num="1" w:sep="0"/>
+          <w:docGrid w:linePitch="360"/>
+        </w:sectPr>
+      </w:pPr>
+    </w:p>
+    <w:p>
+      <w:pPr>
         <w:pStyle w:val="ListNumber"/>
       </w:pPr>
       <w:r>
@@ -4460,6 +4577,17 @@
       </w:r>
     </w:p>
     <w:p>
+      <w:pPr>
+        <w:sectPr>
+          <w:type w:val="continuous"/>
+          <w:pgSz w:w="12240" w:h="20160"/>
+          <w:pgMar w:top="850" w:right="850" w:bottom="850" w:left="850" w:header="720" w:footer="720" w:gutter="0"/>
+          <w:cols w:space="360" w:num="2" w:sep="1"/>
+          <w:docGrid w:linePitch="360"/>
+        </w:sectPr>
+      </w:pPr>
+    </w:p>
+    <w:p>
       <w:r>
         <w:rPr>
           <w:b/>
@@ -4732,6 +4860,17 @@
     </w:p>
     <w:p>
       <w:pPr>
+        <w:sectPr>
+          <w:type w:val="continuous"/>
+          <w:pgSz w:w="12240" w:h="20160"/>
+          <w:pgMar w:top="850" w:right="850" w:bottom="850" w:left="850" w:header="720" w:footer="720" w:gutter="0"/>
+          <w:cols w:space="360" w:num="1" w:sep="0"/>
+          <w:docGrid w:linePitch="360"/>
+        </w:sectPr>
+      </w:pPr>
+    </w:p>
+    <w:p>
+      <w:pPr>
         <w:pStyle w:val="ListBullet"/>
       </w:pPr>
       <w:r>
@@ -4762,6 +4901,17 @@
         </w:rPr>
         <w:t>Other tissues — Pale brown</w:t>
       </w:r>
+    </w:p>
+    <w:p>
+      <w:pPr>
+        <w:sectPr>
+          <w:type w:val="continuous"/>
+          <w:pgSz w:w="12240" w:h="20160"/>
+          <w:pgMar w:top="850" w:right="850" w:bottom="850" w:left="850" w:header="720" w:footer="720" w:gutter="0"/>
+          <w:cols w:space="360" w:num="2" w:sep="1"/>
+          <w:docGrid w:linePitch="360"/>
+        </w:sectPr>
+      </w:pPr>
     </w:p>
     <w:p>
       <w:r>
@@ -5307,6 +5457,17 @@
     </w:p>
     <w:p>
       <w:pPr>
+        <w:sectPr>
+          <w:type w:val="continuous"/>
+          <w:pgSz w:w="12240" w:h="20160"/>
+          <w:pgMar w:top="850" w:right="850" w:bottom="850" w:left="850" w:header="720" w:footer="720" w:gutter="0"/>
+          <w:cols w:space="360" w:num="1" w:sep="0"/>
+          <w:docGrid w:linePitch="360"/>
+        </w:sectPr>
+      </w:pPr>
+    </w:p>
+    <w:p>
+      <w:pPr>
         <w:pStyle w:val="ListBullet"/>
       </w:pPr>
       <w:r>
@@ -5348,6 +5509,17 @@
         </w:rPr>
         <w:t>RBCs — slightly reddish tint</w:t>
       </w:r>
+    </w:p>
+    <w:p>
+      <w:pPr>
+        <w:sectPr>
+          <w:type w:val="continuous"/>
+          <w:pgSz w:w="12240" w:h="20160"/>
+          <w:pgMar w:top="850" w:right="850" w:bottom="850" w:left="850" w:header="720" w:footer="720" w:gutter="0"/>
+          <w:cols w:space="360" w:num="2" w:sep="1"/>
+          <w:docGrid w:linePitch="360"/>
+        </w:sectPr>
+      </w:pPr>
     </w:p>
     <w:p>
       <w:r>
@@ -5629,6 +5801,17 @@
     </w:p>
     <w:p>
       <w:pPr>
+        <w:sectPr>
+          <w:type w:val="continuous"/>
+          <w:pgSz w:w="12240" w:h="20160"/>
+          <w:pgMar w:top="850" w:right="850" w:bottom="850" w:left="850" w:header="720" w:footer="720" w:gutter="0"/>
+          <w:cols w:space="360" w:num="1" w:sep="0"/>
+          <w:docGrid w:linePitch="360"/>
+        </w:sectPr>
+      </w:pPr>
+    </w:p>
+    <w:p>
+      <w:pPr>
         <w:pStyle w:val="ListBullet"/>
       </w:pPr>
       <w:r>
@@ -5683,6 +5866,17 @@
       </w:r>
     </w:p>
     <w:p>
+      <w:pPr>
+        <w:sectPr>
+          <w:type w:val="continuous"/>
+          <w:pgSz w:w="12240" w:h="20160"/>
+          <w:pgMar w:top="850" w:right="850" w:bottom="850" w:left="850" w:header="720" w:footer="720" w:gutter="0"/>
+          <w:cols w:space="360" w:num="2" w:sep="1"/>
+          <w:docGrid w:linePitch="360"/>
+        </w:sectPr>
+      </w:pPr>
+    </w:p>
+    <w:p>
       <w:r>
         <w:rPr>
           <w:b/>
@@ -6110,6 +6304,17 @@
     </w:p>
     <w:p>
       <w:pPr>
+        <w:sectPr>
+          <w:type w:val="continuous"/>
+          <w:pgSz w:w="12240" w:h="20160"/>
+          <w:pgMar w:top="850" w:right="850" w:bottom="850" w:left="850" w:header="720" w:footer="720" w:gutter="0"/>
+          <w:cols w:space="360" w:num="1" w:sep="0"/>
+          <w:docGrid w:linePitch="360"/>
+        </w:sectPr>
+      </w:pPr>
+    </w:p>
+    <w:p>
+      <w:pPr>
         <w:pStyle w:val="ListBullet"/>
       </w:pPr>
       <w:r>
@@ -6140,6 +6345,17 @@
         </w:rPr>
         <w:t>Background — pale green</w:t>
       </w:r>
+    </w:p>
+    <w:p>
+      <w:pPr>
+        <w:sectPr>
+          <w:type w:val="continuous"/>
+          <w:pgSz w:w="12240" w:h="20160"/>
+          <w:pgMar w:top="850" w:right="850" w:bottom="850" w:left="850" w:header="720" w:footer="720" w:gutter="0"/>
+          <w:cols w:space="360" w:num="2" w:sep="1"/>
+          <w:docGrid w:linePitch="360"/>
+        </w:sectPr>
+      </w:pPr>
     </w:p>
     <w:p>
       <w:r>
@@ -6550,6 +6766,17 @@
     </w:p>
     <w:p>
       <w:pPr>
+        <w:sectPr>
+          <w:type w:val="continuous"/>
+          <w:pgSz w:w="12240" w:h="20160"/>
+          <w:pgMar w:top="850" w:right="850" w:bottom="850" w:left="850" w:header="720" w:footer="720" w:gutter="0"/>
+          <w:cols w:space="360" w:num="1" w:sep="0"/>
+          <w:docGrid w:linePitch="360"/>
+        </w:sectPr>
+      </w:pPr>
+    </w:p>
+    <w:p>
+      <w:pPr>
         <w:pStyle w:val="ListBullet"/>
       </w:pPr>
       <w:r>
@@ -6580,6 +6807,17 @@
         </w:rPr>
         <w:t>Nuclei — Red</w:t>
       </w:r>
+    </w:p>
+    <w:p>
+      <w:pPr>
+        <w:sectPr>
+          <w:type w:val="continuous"/>
+          <w:pgSz w:w="12240" w:h="20160"/>
+          <w:pgMar w:top="850" w:right="850" w:bottom="850" w:left="850" w:header="720" w:footer="720" w:gutter="0"/>
+          <w:cols w:space="360" w:num="2" w:sep="1"/>
+          <w:docGrid w:linePitch="360"/>
+        </w:sectPr>
+      </w:pPr>
     </w:p>
     <w:p>
       <w:r>
@@ -6659,7 +6897,7 @@
       <w:type w:val="continuous"/>
       <w:pgSz w:w="12240" w:h="20160"/>
       <w:pgMar w:top="850" w:right="850" w:bottom="850" w:left="850" w:header="720" w:footer="720" w:gutter="0"/>
-      <w:cols w:space="360" w:num="2" w:sep="1"/>
+      <w:cols w:space="360" w:num="1" w:sep="0"/>
       <w:docGrid w:linePitch="360"/>
     </w:sectPr>
   </w:body>

</xml_diff>